<commit_message>
Add editable customer conversation guides and shortlist exports
</commit_message>
<xml_diff>
--- a/docs/P1_edit/EV_Customer_Prioritization_Technical_Report.docx
+++ b/docs/P1_edit/EV_Customer_Prioritization_Technical_Report.docx
@@ -36,7 +36,7 @@
     </w:p>
     <w:p>
       <w:r>
-        <w:t>This project builds a decision support prototype for an illustrative EV dealership that can review only K customer profiles. It estimates the supplied Will_Buy_EV label, ranks profiles, and exports an exact K shortlist with profile context. A staff member would decide whether and how to follow up.</w:t>
+        <w:t>This project builds a decision support prototype for an illustrative EV dealership that can review only K customer profiles. It estimates the supplied Will_Buy_EV label, ranks profiles, and exports an exact K shortlist with profile context. Staff can then prepare an editable Customer Conversation Guide for each selected profile. A staff member decides whether and how to follow up.</w:t>
       </w:r>
     </w:p>
     <w:p>
@@ -64,7 +64,7 @@
     </w:p>
     <w:p>
       <w:r>
-        <w:t>Success means a reproducible shortlist with higher Yes-label concentration than label-independent selection, correct profile attachment, and a usable CSV export. K is chosen by the user; 10% is the fixed comparison capacity for model selection. There is no partner dealership, observed campaign, or financial target in the evidence.</w:t>
+        <w:t>Success means a reproducible shortlist with higher Yes-label concentration than label-independent selection, correct profile attachment, and usable exports. K is chosen by the user; 10% is the fixed comparison capacity for model selection. Conversation guides support staff preparation with consistent needs questions. There is no partner dealership, observed campaign, or measured guide impact in the evidence.</w:t>
       </w:r>
     </w:p>
     <w:p>
@@ -1395,7 +1395,7 @@
     </w:p>
     <w:p>
       <w:r>
-        <w:t>The implemented flow checks profiles, applies a fitted preprocessing pipeline, predicts a Yes-label score, sorts scores, and returns the first K IDs with their uploaded profile context. The same input rules serve training, scoring, and the Streamlit prototype. The diagram includes the intended person and feedback loop so the technical output is connected to its use.</w:t>
+        <w:t>The implemented flow validates profiles, applies the saved pipeline, predicts a Yes-label score, and returns the first K IDs with their profile context. A separate rule-based generator then creates a Customer Conversation Guide with five sections: opening, needs questions, discussion points, concerns, and an appointment or test-drive next step. Deterministic templates use recorded transport and charging facts, without demographic inference, an LLM, an API call, or another model. Staff review and edit the guide; generation does not change scores or ranking.</w:t>
       </w:r>
     </w:p>
     <w:p>
@@ -1443,7 +1443,7 @@
         <w:pStyle w:val="Caption"/>
       </w:pPr>
       <w:r>
-        <w:t>Figure 1. Data to action pipeline adapted from the archived P1 figure. The first four technical stages are completed. Staff contact, outcome collection, and feedback are planned. Dashed arrows mark planned feedback. All icons are original drawings; no customer contacts or live outcomes have been collected.</w:t>
+        <w:t>Figure 1. Data to action pipeline adapted from the archived P1 figure. The first four technical stages are completed; Streamlit delivery also includes editable conversation guides. Staff contact, outcome collection, and feedback remain planned. Dashed arrows mark planned feedback. All icons are original drawings; no customer contacts or live outcomes have been collected.</w:t>
       </w:r>
     </w:p>
     <w:p>
@@ -3819,7 +3819,7 @@
     </w:p>
     <w:p>
       <w:r>
-        <w:t>Results are label associations in one synthetic source. The analysis provides no causal estimate of what a call changes. Treating 78.78% as a sales conversion forecast would change the meaning of the measured outcome.</w:t>
+        <w:t>Results are label associations in one synthetic source. Precision@K and Lift@K assess ranking, not the wording or sales impact of conversation guides. The analysis provides no causal estimate of what a call or script changes. Guide quality needs staff review, and appointment or sales effects require a separate pilot. Treating 78.78% as a conversion forecast would change the measured outcome.</w:t>
       </w:r>
     </w:p>
     <w:p>
@@ -3855,7 +3855,7 @@
     </w:p>
     <w:p>
       <w:r>
-        <w:t>On October 27, a read-only check loaded the current saved model and scored all 500 demo profiles at K=25. All IDs were unique, probabilities were finite and within [0, 1], and the shortlist had exactly 25 rows. Reloaded probabilities, ID order, and shortlist were identical, with maximum absolute score difference 0.0. The 39 passing automated checks cover split and preprocessing separation, selection rules, input validation, exact K, tie order, profile joins, diagnostic records, and app export consistency. These checks support implemented behavior; independent peer reproduction remains pending.</w:t>
+        <w:t>On October 27, a read-only check loaded the current saved model and scored all 500 demo profiles at K=25. All IDs were unique, probabilities were finite and within [0, 1], and the shortlist had exactly 25 rows. Reloaded probabilities, ID order, and shortlist were identical, with maximum absolute score difference 0.0. The 53 passing automated checks cover model boundaries, validation, exact K, ID alignment, rule branches, guide wording without demographic inference, edit retention and reset, and export refresh. These checks support implementation; independent peer reproduction remains pending.</w:t>
       </w:r>
     </w:p>
     <w:p>
@@ -3913,7 +3913,7 @@
     </w:p>
     <w:p>
       <w:r>
-        <w:t>Run python -m unittest discover -s tests, then python -m streamlit run app.py. The prototype accepts a CSV, checks fields, asks for K, displays ranked profile facts and consultation questions, and downloads the shortlist or full ranking. It does not contain names, phone numbers, contact execution, or observed outcomes. Independent peer replication remains pending and must be recorded separately from these local checks.</w:t>
+        <w:t>Run python -m unittest discover -s tests, then python -m streamlit run app.py. The app ranks up to 300,000 profiles. Bulk guide CSV generation supports K up to 1,000 to bound memory; individual guide viewing and .txt downloads remain available for larger shortlists. Staff edits stay in session memory, so export them before leaving or changing the uploaded file. The guide CSV contains all 13 profile fields, rank, ID, score, script, and edit status. Prepare it again after editing a script. The saved model is unchanged, with no retraining or automatic contact. Independent peer replication remains pending.</w:t>
       </w:r>
     </w:p>
     <w:p>
@@ -3931,7 +3931,7 @@
     </w:p>
     <w:p>
       <w:r>
-        <w:t>Use the saved Logistic Regression pipeline as the current demonstration model and the exact K ranking as the product behavior. Preserve the fixed comparison and holdout records. A stakeholder can inspect how capacity changes coverage and concentration, review profile context, and export a worklist. Any real campaign should begin with permitted data and an evaluation plan agreed with the business owner.</w:t>
+        <w:t>Use the saved Logistic Regression pipeline as the current demonstration model and the exact K ranking as the product behavior. Preserve the fixed comparison and holdout records. Staff can inspect the capacity tradeoff, review profile context, edit the corresponding conversation guide, and export a worklist. Any real campaign should begin with permitted data and an evaluation plan agreed with the business owner.</w:t>
       </w:r>
     </w:p>
     <w:p>
@@ -3954,7 +3954,7 @@
     </w:p>
     <w:p>
       <w:r>
-        <w:t>The app checks known input rules and warns about values outside observed numeric ranges. Those checks cannot detect every unfamiliar population or ensure a score is calibrated. Training range warnings, input drift, and observed performance answer different questions; useful performance monitoring requires newly verified labels.</w:t>
+        <w:t>The app checks known input rules and warns about values outside observed numeric ranges. Those checks cannot establish calibration in a new population. Conversation rules do not create offers or prices, promise savings, or determine eligibility. Their questions use recorded transport and charging facts; staff must confirm the facts and the customer's needs. Guide content and edits need separate review, while measuring predictive or campaign performance requires newly verified outcomes.</w:t>
       </w:r>
     </w:p>
     <w:p>
@@ -3967,7 +3967,7 @@
     </w:p>
     <w:p>
       <w:r>
-        <w:t>First, complete independent peer reproduction and incorporate specific instructor feedback. Next, evaluate subgroup and demographic-feature choices on development data, quantify uncertainty with an appropriate resampling design, and assess calibration and ranking on fresh permitted data. A pilot should record who was eligible, who was contacted, verified outcomes, and costs before any claim about campaign value. An experimental comparison is needed to estimate the effect of outreach.</w:t>
+        <w:t>First, complete independent peer reproduction and incorporate specific instructor feedback. Next, evaluate subgroup and demographic-feature choices on development data, quantify uncertainty with appropriate resampling, and assess calibration and ranking on fresh permitted data. Review guide factual consistency, question relevance, and staff editing needs in a pilot. Record profile selection, contact, verified outcomes, and costs before claiming campaign value; an experimental comparison is needed to estimate the effect of outreach or the guide.</w:t>
       </w:r>
     </w:p>
     <w:tbl>
@@ -4664,7 +4664,7 @@
         <w:rPr>
           <w:sz w:val="18"/>
         </w:rPr>
-        <w:t>Data: docs/reports/data_manifest.json and docs/reports/tables. Model experiment: docs/reports/modeling/methodology.json, split_summary.csv, validation_metrics.csv, validation_ranking.csv, holdout_metrics.csv, holdout_ranking.csv, and holdout_confusion_matrix.csv. Artifact: models/model_bundle.joblib and model_metadata.json. Runnable source: notebooks and ev_project. Input, model, and app checks: tests. The diagnostic run and load test are identified in their new evidence files.</w:t>
+        <w:t>Data: docs/reports/data_manifest.json and docs/reports/tables. Model experiment: docs/reports/modeling/methodology.json, split_summary.csv, validation_metrics.csv, validation_ranking.csv, holdout_metrics.csv, holdout_ranking.csv, and holdout_confusion_matrix.csv. Artifact: models/model_bundle.joblib and model_metadata.json. Runnable source: notebooks and ev_project. Input, model, and app checks: tests. Conversation rules and exports: ev_project/conversation_guide.py. Checks: tests/test_conversation_guide.py and tests/test_app.py.</w:t>
       </w:r>
     </w:p>
     <w:p>
@@ -4706,6 +4706,17 @@
           <w:sz w:val="18"/>
         </w:rPr>
         <w:t>This revision expands the archived P1 proposal into the ten-section paper, adds interpreted training and evaluation evidence, retains an icon pipeline with completed and planned steps, and is paired with a stakeholder deck in plain business language. This response addresses general project guidance. Individual review feedback and the resulting revisions will be tracked separately when received. Independent peer replication and the signed form remain separate handoff tasks.</w:t>
+      </w:r>
+    </w:p>
+    <w:p>
+      <w:pPr>
+        <w:spacing w:after="80" w:line="257" w:lineRule="auto"/>
+      </w:pPr>
+      <w:r>
+        <w:rPr>
+          <w:sz w:val="18"/>
+        </w:rPr>
+        <w:t>The October 27 feature update adds a staff-editable five-section Customer Conversation Guide after ranking, with session-only edits and selected-text or batch-CSV export. It uses deterministic rules and the existing profile facts; the fitted model and reported ranking results are unchanged. The guide supports preparation, and its business impact remains a question for pilot evaluation.</w:t>
       </w:r>
     </w:p>
     <w:p>

</xml_diff>